<commit_message>
Rebuild report PDF and Word version
Co-Authored-By: Claude Haiku 5.5 <noreply@anthropic.com>
Claude-Session: https://claude.ai/code/session_01UNNbyjKKiB6rivZNGFeLfa
</commit_message>
<xml_diff>
--- a/report/CaseStudyReport.docx
+++ b/report/CaseStudyReport.docx
@@ -7,13 +7,38 @@
         <w:jc w:val="center"/>
       </w:pPr>
       <w:r>
-        <w:rPr>
-          <w:rFonts w:ascii="Times New Roman" w:hAnsi="Times New Roman" w:cs="Times New Roman" w:eastAsia="Times New Roman"/>
-          <w:i/>
-          <w:color w:val="000000"/>
-          <w:sz w:val="22"/>
-        </w:rPr>
-        <w:t>[SIT Pune logo – insert picture here]</w:t>
+        <w:drawing>
+          <wp:inline xmlns:a="http://schemas.openxmlformats.org/drawingml/2006/main" xmlns:pic="http://schemas.openxmlformats.org/drawingml/2006/picture">
+            <wp:extent cx="7274959" cy="1152000"/>
+            <wp:docPr id="1" name="Picture 1"/>
+            <wp:cNvGraphicFramePr>
+              <a:graphicFrameLocks noChangeAspect="1"/>
+            </wp:cNvGraphicFramePr>
+            <a:graphic>
+              <a:graphicData uri="http://schemas.openxmlformats.org/drawingml/2006/picture">
+                <pic:pic>
+                  <pic:nvPicPr>
+                    <pic:cNvPr id="0" name="sit_logo.png"/>
+                    <pic:cNvPicPr/>
+                  </pic:nvPicPr>
+                  <pic:blipFill>
+                    <a:blip r:embed="rId9"/>
+                    <a:stretch>
+                      <a:fillRect/>
+                    </a:stretch>
+                  </pic:blipFill>
+                  <pic:spPr>
+                    <a:xfrm>
+                      <a:off x="0" y="0"/>
+                      <a:ext cx="7274959" cy="1152000"/>
+                    </a:xfrm>
+                    <a:prstGeom prst="rect"/>
+                  </pic:spPr>
+                </pic:pic>
+              </a:graphicData>
+            </a:graphic>
+          </wp:inline>
+        </w:drawing>
       </w:r>
     </w:p>
     <w:p>
@@ -87,7 +112,7 @@
           <w:color w:val="000000"/>
           <w:sz w:val="28"/>
         </w:rPr>
-        <w:t xml:space="preserve"> G__</w:t>
+        <w:t xml:space="preserve"> G53</w:t>
       </w:r>
     </w:p>
     <w:p>
@@ -274,7 +299,7 @@
           <w:color w:val="000000"/>
           <w:sz w:val="24"/>
         </w:rPr>
-        <w:t>PowerShell is a scripting tool that comes with every Windows computer. Attackers often use it because it is trusted, powerful and can run code directly in memory without leaving files on disk. This case study examines how PowerShell has been used in real attacks, including the Odinaff attacks on banks, the POSHSPY backdoor of the APT29 group, the Emotet malware campaigns and the REvil ransomware attack through Kaseya VSA. These cases show that traditional signature-based antivirus finds it hard to catch such scripts, because attackers can easily change the text of a script while keeping its behaviour the same. Based on the lessons from these cases, we built and tested a machine-learning system that reads a PowerShell script, decides whether it is malicious, and takes an automatic response according to its risk. Using the public MPSD dataset, from which more than half of the malicious files had to be removed as duplicates, an ensemble model achieved an F1-score of 0.972, detecting 96.2% of malicious scripts while wrongly flagging only 0.7% of benign scripts. In a test on unseen scripts, the automatic response system contained 91.2% of malicious scripts and wrongly blocked only 0.23% of benign ones. The study shows that explainable machine learning combined with a careful, human-supervised response policy can help organisations defend against PowerShell attacks.</w:t>
+        <w:t>PowerShell is an automation tool that is available in all versions of Windows. The reason why adversaries use PowerShell is its reliability, features, and execution of code in memory without writing to the disk. This case study examines how PowerShell has been used in real attacks, including the Odinaff attacks on banks, the POSHSPY backdoor of the APT29 group, the Emotet malware campaigns and the REvil ransomware attack through Kaseya VSA. These cases show that traditional signature-based antivirus finds it hard to catch such scripts, because attackers can easily change the text of a script while keeping its behaviour the same. Based on the lessons from these cases, we built and tested a machine-learning system that reads a PowerShell script, decides whether it is malicious, and takes an automatic response according to its risk. Using the public MPSD dataset, from which more than half of the malicious files had to be removed as duplicates, an ensemble model achieved an F1-score of 0.972, detecting 96.2% of malicious scripts while wrongly flagging only 0.7% of benign scripts. In a test on unseen scripts, the automatic response system contained 91.2% of malicious scripts and wrongly blocked only 0.23% of benign ones. The study shows that explainable machine learning combined with a careful, human-supervised response policy can help organisations defend against PowerShell attacks.</w:t>
       </w:r>
     </w:p>
     <w:p>
@@ -439,181 +464,6 @@
           <w:sz w:val="24"/>
         </w:rPr>
         <w:t xml:space="preserve"> Given the text of a PowerShell script captured on a Windows computer, the system should (1) decide whether the script is malicious, with very few false alarms, and (2) automatically take a suitable action, such as raising an alert or blocking the script, while leaving the most serious actions to a human analyst.</w:t>
-      </w:r>
-    </w:p>
-    <w:p>
-      <w:pPr>
-        <w:jc w:val="both"/>
-      </w:pPr>
-      <w:r>
-        <w:rPr>
-          <w:rFonts w:ascii="Times New Roman" w:hAnsi="Times New Roman" w:cs="Times New Roman" w:eastAsia="Times New Roman"/>
-          <w:b/>
-          <w:i w:val="0"/>
-          <w:color w:val="000000"/>
-          <w:sz w:val="24"/>
-        </w:rPr>
-        <w:t>Objectives.</w:t>
-      </w:r>
-      <w:r>
-        <w:rPr>
-          <w:rFonts w:ascii="Times New Roman" w:hAnsi="Times New Roman" w:cs="Times New Roman" w:eastAsia="Times New Roman"/>
-          <w:b w:val="0"/>
-          <w:i w:val="0"/>
-          <w:color w:val="000000"/>
-          <w:sz w:val="24"/>
-        </w:rPr>
-        <w:t xml:space="preserve"> </w:t>
-      </w:r>
-      <w:r>
-        <w:rPr>
-          <w:rFonts w:ascii="Times New Roman" w:hAnsi="Times New Roman" w:cs="Times New Roman" w:eastAsia="Times New Roman"/>
-          <w:b w:val="0"/>
-          <w:i w:val="0"/>
-          <w:color w:val="000000"/>
-          <w:sz w:val="24"/>
-        </w:rPr>
-        <w:t xml:space="preserve"> The objectives of this case study are:</w:t>
-      </w:r>
-    </w:p>
-    <w:p>
-      <w:pPr>
-        <w:tabs>
-          <w:tab w:pos="567" w:val="left"/>
-        </w:tabs>
-        <w:spacing w:after="60"/>
-        <w:ind w:left="567" w:hanging="340"/>
-        <w:jc w:val="both"/>
-      </w:pPr>
-      <w:r>
-        <w:rPr>
-          <w:rFonts w:ascii="Times New Roman" w:hAnsi="Times New Roman" w:cs="Times New Roman" w:eastAsia="Times New Roman"/>
-          <w:color w:val="000000"/>
-        </w:rPr>
-        <w:t>1.</w:t>
-        <w:tab/>
-      </w:r>
-      <w:r>
-        <w:rPr>
-          <w:rFonts w:ascii="Times New Roman" w:hAnsi="Times New Roman" w:cs="Times New Roman" w:eastAsia="Times New Roman"/>
-          <w:b w:val="0"/>
-          <w:i w:val="0"/>
-          <w:color w:val="000000"/>
-          <w:sz w:val="24"/>
-        </w:rPr>
-        <w:t>to study how PowerShell has been used in real attacks and what defenders can learn from them;</w:t>
-      </w:r>
-    </w:p>
-    <w:p>
-      <w:pPr>
-        <w:tabs>
-          <w:tab w:pos="567" w:val="left"/>
-        </w:tabs>
-        <w:spacing w:after="60"/>
-        <w:ind w:left="567" w:hanging="340"/>
-        <w:jc w:val="both"/>
-      </w:pPr>
-      <w:r>
-        <w:rPr>
-          <w:rFonts w:ascii="Times New Roman" w:hAnsi="Times New Roman" w:cs="Times New Roman" w:eastAsia="Times New Roman"/>
-          <w:color w:val="000000"/>
-        </w:rPr>
-        <w:t>2.</w:t>
-        <w:tab/>
-      </w:r>
-      <w:r>
-        <w:rPr>
-          <w:rFonts w:ascii="Times New Roman" w:hAnsi="Times New Roman" w:cs="Times New Roman" w:eastAsia="Times New Roman"/>
-          <w:b w:val="0"/>
-          <w:i w:val="0"/>
-          <w:color w:val="000000"/>
-          <w:sz w:val="24"/>
-        </w:rPr>
-        <w:t>to review existing research on detecting malicious PowerShell;</w:t>
-      </w:r>
-    </w:p>
-    <w:p>
-      <w:pPr>
-        <w:tabs>
-          <w:tab w:pos="567" w:val="left"/>
-        </w:tabs>
-        <w:spacing w:after="60"/>
-        <w:ind w:left="567" w:hanging="340"/>
-        <w:jc w:val="both"/>
-      </w:pPr>
-      <w:r>
-        <w:rPr>
-          <w:rFonts w:ascii="Times New Roman" w:hAnsi="Times New Roman" w:cs="Times New Roman" w:eastAsia="Times New Roman"/>
-          <w:color w:val="000000"/>
-        </w:rPr>
-        <w:t>3.</w:t>
-        <w:tab/>
-      </w:r>
-      <w:r>
-        <w:rPr>
-          <w:rFonts w:ascii="Times New Roman" w:hAnsi="Times New Roman" w:cs="Times New Roman" w:eastAsia="Times New Roman"/>
-          <w:b w:val="0"/>
-          <w:i w:val="0"/>
-          <w:color w:val="000000"/>
-          <w:sz w:val="24"/>
-        </w:rPr>
-        <w:t>to build and compare machine-learning models that detect malicious scripts;</w:t>
-      </w:r>
-    </w:p>
-    <w:p>
-      <w:pPr>
-        <w:tabs>
-          <w:tab w:pos="567" w:val="left"/>
-        </w:tabs>
-        <w:spacing w:after="60"/>
-        <w:ind w:left="567" w:hanging="340"/>
-        <w:jc w:val="both"/>
-      </w:pPr>
-      <w:r>
-        <w:rPr>
-          <w:rFonts w:ascii="Times New Roman" w:hAnsi="Times New Roman" w:cs="Times New Roman" w:eastAsia="Times New Roman"/>
-          <w:color w:val="000000"/>
-        </w:rPr>
-        <w:t>4.</w:t>
-        <w:tab/>
-      </w:r>
-      <w:r>
-        <w:rPr>
-          <w:rFonts w:ascii="Times New Roman" w:hAnsi="Times New Roman" w:cs="Times New Roman" w:eastAsia="Times New Roman"/>
-          <w:b w:val="0"/>
-          <w:i w:val="0"/>
-          <w:color w:val="000000"/>
-          <w:sz w:val="24"/>
-        </w:rPr>
-        <w:t>to design an automated response that acts according to the risk of each script; and</w:t>
-      </w:r>
-    </w:p>
-    <w:p>
-      <w:pPr>
-        <w:tabs>
-          <w:tab w:pos="567" w:val="left"/>
-        </w:tabs>
-        <w:spacing w:after="60"/>
-        <w:ind w:left="567" w:hanging="340"/>
-        <w:jc w:val="both"/>
-      </w:pPr>
-      <w:r>
-        <w:rPr>
-          <w:rFonts w:ascii="Times New Roman" w:hAnsi="Times New Roman" w:cs="Times New Roman" w:eastAsia="Times New Roman"/>
-          <w:color w:val="000000"/>
-        </w:rPr>
-        <w:t>5.</w:t>
-        <w:tab/>
-      </w:r>
-      <w:r>
-        <w:rPr>
-          <w:rFonts w:ascii="Times New Roman" w:hAnsi="Times New Roman" w:cs="Times New Roman" w:eastAsia="Times New Roman"/>
-          <w:b w:val="0"/>
-          <w:i w:val="0"/>
-          <w:color w:val="000000"/>
-          <w:sz w:val="24"/>
-        </w:rPr>
-        <w:t>to evaluate the system and relate its results back to the real-world cases.</w:t>
       </w:r>
     </w:p>
     <w:p>
@@ -725,7 +575,7 @@
         <w:drawing>
           <wp:inline xmlns:a="http://schemas.openxmlformats.org/drawingml/2006/main" xmlns:pic="http://schemas.openxmlformats.org/drawingml/2006/picture">
             <wp:extent cx="5217871" cy="1728673"/>
-            <wp:docPr id="1" name="Picture 1"/>
+            <wp:docPr id="2" name="Picture 2"/>
             <wp:cNvGraphicFramePr>
               <a:graphicFrameLocks noChangeAspect="1"/>
             </wp:cNvGraphicFramePr>
@@ -737,7 +587,7 @@
                     <pic:cNvPicPr/>
                   </pic:nvPicPr>
                   <pic:blipFill>
-                    <a:blip r:embed="rId10"/>
+                    <a:blip r:embed="rId11"/>
                     <a:stretch>
                       <a:fillRect/>
                     </a:stretch>
@@ -812,7 +662,7 @@
           <w:color w:val="000000"/>
           <w:sz w:val="24"/>
         </w:rPr>
-        <w:t xml:space="preserve"> Figure 2 places the cases discussed below alongside important defensive milestones. Attackers adopted PowerShell early, and defenders have gradually responded with better logging, research tools and official guidance, yet scripting interpreters are still the most observed attack technique today [4].</w:t>
+        <w:t xml:space="preserve"> Figure 2 illustrates where the attacks mentioned in the following discussion stand in relation to a number of important defensive milestones. The attackers started using PowerShell early on, and the defenders have responded to this by doing things like improving logging and producing research tools and official guidelines. Scripting interpreters are still the most commonly seen method of attack [4].</w:t>
       </w:r>
     </w:p>
     <w:p>
@@ -825,7 +675,7 @@
         <w:drawing>
           <wp:inline xmlns:a="http://schemas.openxmlformats.org/drawingml/2006/main" xmlns:pic="http://schemas.openxmlformats.org/drawingml/2006/picture">
             <wp:extent cx="5478475" cy="2171700"/>
-            <wp:docPr id="2" name="Picture 2"/>
+            <wp:docPr id="3" name="Picture 3"/>
             <wp:cNvGraphicFramePr>
               <a:graphicFrameLocks noChangeAspect="1"/>
             </wp:cNvGraphicFramePr>
@@ -837,7 +687,7 @@
                     <pic:cNvPicPr/>
                   </pic:nvPicPr>
                   <pic:blipFill>
-                    <a:blip r:embed="rId11"/>
+                    <a:blip r:embed="rId12"/>
                     <a:stretch>
                       <a:fillRect/>
                     </a:stretch>
@@ -892,7 +742,7 @@
           <w:color w:val="000000"/>
           <w:sz w:val="24"/>
         </w:rPr>
-        <w:t>Case 1: Odinaff attacks on financial organisations (2016).</w:t>
+        <w:t>Case 1: Odinaff attacks on financial organizations in 2016.</w:t>
       </w:r>
       <w:r>
         <w:rPr>
@@ -912,7 +762,7 @@
           <w:color w:val="000000"/>
           <w:sz w:val="24"/>
         </w:rPr>
-        <w:t xml:space="preserve"> In 2016, Symantec reported a series of targeted attacks on banks, securities and trading firms and payroll companies around the world, carried out with a trojan called Odinaff [9]. The trojan was delivered through malicious Word macros, password-protected archives and existing botnets. Once inside a network, the attackers used lightweight hacking tools such as Mimikatz together with legitimate utilities such as PowerShell to move between computers and find important systems; some victims were users of the SWIFT interbank messaging system. This case shows how criminals combine PowerShell with password-stealing tools to explore a network quietly, because activity by a legitimate administration tool does not raise suspicion on its own.</w:t>
+        <w:t xml:space="preserve"> Symantec reported in 2016 on a series of targeted attacks against financial institutions, including banks, securities, and trading companies as well as payroll providers around the world, which were carried out using a Trojan dubbed Odinaff [9]. The Trojan was delivered using malicious Word macros, password-protected files, and existing botnets. Once inside the network, the hackers used lightweight hacking tools like Mimikatz along with legitimate utilities like PowerShell to explore the network and find important systems; some of the organizations affected were part of the SWIFT financial messaging network. Here, we see how cybercriminals leverage PowerShell alongside password stealing tools for stealthy network reconnaissance because the legitimate use of an administrative tool is, by itself, suspicious-free.</w:t>
       </w:r>
     </w:p>
     <w:p>
@@ -947,7 +797,7 @@
           <w:color w:val="000000"/>
           <w:sz w:val="24"/>
         </w:rPr>
-        <w:t xml:space="preserve"> Mandiant described POSHSPY, a backdoor used by the state-sponsored group APT29 as a secret fallback in case its main tools were discovered [10]. POSHSPY was built entirely from PowerShell and Windows Management Instrumentation (WMI). Its encrypted PowerShell code was stored inside a custom WMI property instead of a file, and a WMI event subscription restarted it automatically. It could download and run more PowerShell code and programs, and it contacted its servers rarely and through legitimate local websites. Mandiant noted that, because only legitimate system processes were used, the malicious activity could be identified only through enhanced logging or memory analysis. This case shows the importance of PowerShell logging: without it, a fileless backdoor can stay hidden for long periods.</w:t>
+        <w:t xml:space="preserve"> According to Mandiant, POSHSPY is a backdoor deployed by the state-sponsored APT29 in case their main tools got detected [10]. The POSHSPY malware was solely written in PowerShell and WMI. The encrypted PowerShell script was located in a custom WMI property and not in the file while the WMI event subscription ensured automatic restarts. This malware had the ability to download and execute other scripts and programs while connecting to its command and control servers rarely using legitimate local websites. Mandiant stated that because all processes used were legitimate, the malware could only be seen through enhanced logging or memory forensics. This is a clear example of why PowerShell logging is vital since without such logging, fileless malware can stay undetected for a very long time.</w:t>
       </w:r>
     </w:p>
     <w:p>
@@ -962,7 +812,7 @@
           <w:color w:val="000000"/>
           <w:sz w:val="24"/>
         </w:rPr>
-        <w:t>Case 3: Emotet malware campaigns (2014 onwards).</w:t>
+        <w:t>Case 3: Emotet malware campaigns 2014 onwards.</w:t>
       </w:r>
       <w:r>
         <w:rPr>
@@ -982,7 +832,7 @@
           <w:color w:val="000000"/>
           <w:sz w:val="24"/>
         </w:rPr>
-        <w:t xml:space="preserve"> Emotet started as a banking trojan and became one of the most widespread malware families in the world, often delivering other malware such as ransomware. In October 2020, CISA warned of a large increase in Emotet phishing emails targeting state and local governments, noting that Emotet spreads through networks by guessing passwords and copying itself to shared drives [12]. Many Emotet campaigns used Word documents whose macros launched an obfuscated PowerShell command to download the malware. Patsakis et al. studied such PowerShell droppers from real Emotet campaigns and found them heavily disguised, so that even advanced language models could not always recover the hidden download addresses [14]. This case shows that obfuscation is used at large scale and that defences based on fixed strings are easily bypassed.</w:t>
+        <w:t xml:space="preserve"> The Emotet malware initially started as a banking Trojan and has become one of the most widespread malware families in the world, often serving as a vector for other malicious software, including ransomware. In October 2020, CISA warned of an increase in the number of Emotet phishing attacks targeted at state and local governmental organizations, indicating that Emotet spreads inside the network via guessing passwords and replication onto the shared drives [12]. Many instances of Emotet campaigns used Word documents containing macros that ran an obfuscated PowerShell script, which retrieved the malware from a remote server. Analyzing PowerShell droppers used in the Emotet campaigns, Patsakis et al. discovered that they were highly obfuscated, and even the best language models could not reveal the download URLs of the hidden files [14].</w:t>
       </w:r>
     </w:p>
     <w:p>
@@ -1017,7 +867,7 @@
           <w:color w:val="000000"/>
           <w:sz w:val="24"/>
         </w:rPr>
-        <w:t xml:space="preserve"> On 2 July 2021, an affiliate of the REvil ransomware group exploited Kaseya VSA, a remote management tool used by managed service providers, and pushed a malicious update to their customers, affecting hundreds of businesses in a single day [13]. Because the management agent ran with high privileges, the attackers used a PowerShell command to switch off Microsoft Defender's real-time protection and script scanning before deploying the ransomware [15]. This case shows how quickly modern attacks can spread: a single malicious update reached hundreds of businesses on the same day, leaving little time for manual investigation. It also shows that a script trying to disable security tools is itself a strong warning sign.</w:t>
+        <w:t xml:space="preserve"> On 2 July 2021, the affiliate of REvil ransomware gang leveraged the vulnerabilities in Kaseya VSA, the software used for managing remote access by managed services providers, and released the malicious update to the clients' computers, thereby affecting hundreds of companies in a single day [13]. Since the management agent was running at high privileges, the attackers used the PowerShell command to turn off Microsoft Defender real-time protection and script scanning prior to launching ransomware [15]. Thus, this example shows how fast modern attacks can spread – only one malicious update infected hundreds of companies in one day without much room left for manual analysis.</w:t>
       </w:r>
     </w:p>
     <w:p>
@@ -2249,7 +2099,7 @@
           <w:color w:val="000000"/>
           <w:sz w:val="24"/>
         </w:rPr>
-        <w:t xml:space="preserve"> Because scripts are easily disguised, detection should use patterns that survive small changes.</w:t>
+        <w:t xml:space="preserve"> Since scripts can easily be hidden, detection must depend on characteristics that will withstand any slight changes.</w:t>
       </w:r>
     </w:p>
     <w:p>
@@ -2287,7 +2137,7 @@
           <w:color w:val="000000"/>
           <w:sz w:val="24"/>
         </w:rPr>
-        <w:t xml:space="preserve"> Administrators use PowerShell every day, so a detector that blocks legitimate work will not be trusted.</w:t>
+        <w:t xml:space="preserve"> Admins use PowerShell for their day-to-day tasks; therefore, a detection system that inhibits the normal processes of admins will be regarded with suspicion.</w:t>
       </w:r>
     </w:p>
     <w:p>
@@ -2325,7 +2175,7 @@
           <w:color w:val="000000"/>
           <w:sz w:val="24"/>
         </w:rPr>
-        <w:t xml:space="preserve"> Ransomware can spread very quickly, so routine actions must happen without waiting for a person.</w:t>
+        <w:t xml:space="preserve"> Ransomware spread is quick, calling for regular operations to be done without waiting for human assistance.</w:t>
       </w:r>
     </w:p>
     <w:p>
@@ -2363,7 +2213,7 @@
           <w:color w:val="000000"/>
           <w:sz w:val="24"/>
         </w:rPr>
-        <w:t xml:space="preserve"> Alerts should say what the script was trying to do, for example in ATT&amp;CK terms [18], so analysts can act on them.</w:t>
+        <w:t xml:space="preserve"> The alerts must be set to reflect the purpose of the script being executed, e.g., based on ATT&amp;CK [18] terminology.</w:t>
       </w:r>
     </w:p>
     <w:p>
@@ -2477,7 +2327,7 @@
           <w:color w:val="000000"/>
           <w:sz w:val="24"/>
         </w:rPr>
-        <w:t>Researchers have also warned that machine-learning results in security can look better than they really are. Sommer and Paxson explained why intrusion detection is harder than ordinary classification [35]. Arp et al. listed common mistakes, such as allowing very similar samples to appear in both training and test data [36], and Pendlebury et al. showed that careless data splitting can make malware detectors appear much more accurate than they are [37]. On the response side, security orchestration, automation and response (SOAR) tools connect detection to automatic actions [38], and provenance-based methods help analysts handle large numbers of alerts [7], [39].</w:t>
+        <w:t>Researchers have also warned that machine-learning results in security can look better than they really are. Sommer and Paxson explained why intrusion detection is harder than ordinary classification [35]. Arp et al. listed common mistakes, such as allowing very similar samples to appear in both training and test data [36], and Pendlebury et al. showed that careless data splitting can make malware detectors appear much more accurate than they are [37]. Concerning the response aspect, SOAR technologies are used to bind the detection process with the action [38], while provenance-based techniques support analysts in dealing with a huge number of alerts [7], [39].</w:t>
       </w:r>
     </w:p>
     <w:p>
@@ -2492,7 +2342,7 @@
           <w:color w:val="000000"/>
           <w:sz w:val="24"/>
         </w:rPr>
-        <w:t>Table 3 summarises important studies. Most previous work focuses only on detection and reports very high accuracy, but few studies check their datasets for duplicate samples, and very few connect detection to an automatic response. This case study addresses both gaps.</w:t>
+        <w:t>Table 3 is a list of some important studies. Most previous studies have focused solely on the detection aspect with highly accurate rates of performance. However, very few of them have analyzed duplicates within their datasets, and still fewer have incorporated detection with the response action.</w:t>
       </w:r>
     </w:p>
     <w:p>
@@ -3075,7 +2925,7 @@
         <w:drawing>
           <wp:inline xmlns:a="http://schemas.openxmlformats.org/drawingml/2006/main" xmlns:pic="http://schemas.openxmlformats.org/drawingml/2006/picture">
             <wp:extent cx="4771948" cy="1534668"/>
-            <wp:docPr id="3" name="Picture 3"/>
+            <wp:docPr id="4" name="Picture 4"/>
             <wp:cNvGraphicFramePr>
               <a:graphicFrameLocks noChangeAspect="1"/>
             </wp:cNvGraphicFramePr>
@@ -3087,7 +2937,7 @@
                     <pic:cNvPicPr/>
                   </pic:nvPicPr>
                   <pic:blipFill>
-                    <a:blip r:embed="rId12"/>
+                    <a:blip r:embed="rId13"/>
                     <a:stretch>
                       <a:fillRect/>
                     </a:stretch>
@@ -3269,7 +3119,7 @@
         <w:drawing>
           <wp:inline xmlns:a="http://schemas.openxmlformats.org/drawingml/2006/main" xmlns:pic="http://schemas.openxmlformats.org/drawingml/2006/picture">
             <wp:extent cx="2145639" cy="471983"/>
-            <wp:docPr id="4" name="Picture 4"/>
+            <wp:docPr id="5" name="Picture 5"/>
             <wp:cNvGraphicFramePr>
               <a:graphicFrameLocks noChangeAspect="1"/>
             </wp:cNvGraphicFramePr>
@@ -3281,7 +3131,7 @@
                     <pic:cNvPicPr/>
                   </pic:nvPicPr>
                   <pic:blipFill>
-                    <a:blip r:embed="rId13"/>
+                    <a:blip r:embed="rId14"/>
                     <a:stretch>
                       <a:fillRect/>
                     </a:stretch>
@@ -3547,7 +3397,7 @@
         <w:drawing>
           <wp:inline xmlns:a="http://schemas.openxmlformats.org/drawingml/2006/main" xmlns:pic="http://schemas.openxmlformats.org/drawingml/2006/picture">
             <wp:extent cx="4881981" cy="451714"/>
-            <wp:docPr id="5" name="Picture 5"/>
+            <wp:docPr id="6" name="Picture 6"/>
             <wp:cNvGraphicFramePr>
               <a:graphicFrameLocks noChangeAspect="1"/>
             </wp:cNvGraphicFramePr>
@@ -3559,7 +3409,7 @@
                     <pic:cNvPicPr/>
                   </pic:nvPicPr>
                   <pic:blipFill>
-                    <a:blip r:embed="rId14"/>
+                    <a:blip r:embed="rId15"/>
                     <a:stretch>
                       <a:fillRect/>
                     </a:stretch>
@@ -4101,7 +3951,7 @@
           <w:color w:val="000000"/>
           <w:sz w:val="24"/>
         </w:rPr>
-        <w:t>The system was written in Python 3.13 using scikit-learn for machine learning, pandas and NumPy for data handling and Matplotlib for graphs, and it was run on an ordinary computer with a 4-core processor and 15 GB of memory, without a GPU. The code has four parts: a data module that cleans the dataset, a feature module that calculates the text and behaviour features, a model module that trains and tests the models, and a response module. The response module reads Windows Event ID 4104 records, obtains a risk score from the model, chooses the response level, adds the matching ATT&amp;CK technique and writes the decision to a log. For safety, it runs in a test (dry-run) mode in which actions are recorded but not actually carried out. In a real organisation, Script Block Logging would be enabled through Group Policy [16], the logs would be sent to a central server for scoring, and the response module would be connected to the organisation's security tools. Seven unit tests check the main functions, and all of them pass.</w:t>
+        <w:t>The system was written in Python 3.13 using scikit-learn for machine learning, pandas and NumPy for data handling and Matplotlib for graphs, and it was run on an ordinary computer with a 4-core processor and 15 GB of memory, without a GPU. This program consists of four modules: data, which cleanses data set; features, which calculates textual and behavioral features; model, which trains and tests models; and response modules. Response module gets input from Windows Event ID 4104 data and calculates risk score from model, response level from this risk score, related ATT&amp;CK technique and makes record in log. For security reasons, this module runs in “dry-run” mode, where actions are simulated but not performed. In a real business environment, Script Block Logging would be enabled by Group Policy [16]; logs will be transferred to the central server for risk scoring, and the response module will interact with company's security infrastructure. Seven unit tests check the key functionality, and all the tests pass successfully.</w:t>
       </w:r>
     </w:p>
     <w:p>
@@ -4150,7 +4000,7 @@
           <w:color w:val="000000"/>
           <w:sz w:val="24"/>
         </w:rPr>
-        <w:t xml:space="preserve"> Table 5 shows the results of all models, and Figure 4 compares their F1-scores. All models performed well, which shows that malicious and benign PowerShell scripts are clearly different. The text-based LR model had the highest F1-score (0.974), and the ensemble was almost the same (0.972) but produced fewer false alarms (30 compared with 37). Since false alarms can stop legitimate administrative work, which was the third requirement from the case study, the ensemble was chosen for the response system. The behaviour-only LR model was the weakest, which shows that tree-based models capture patterns that a simple linear model misses.</w:t>
+        <w:t xml:space="preserve"> The results obtained from all the models are shown in Table 5, while the F1-scores are compared in Figure 4. All models performed very well, showing that it is easy to tell the difference between a bad and good PowerShell script. The best performing model among the four models is the text-based logistic regression (LR) model with an F1-score of 0.974; the ensemble model had the almost similar F1-score of 0.972 but had fewer false positives (30 vs 37). Since false positives may interfere with the administration activities, and that is the third criterion of the case study, we opted for the ensemble.</w:t>
       </w:r>
     </w:p>
     <w:p>
@@ -5032,7 +4882,7 @@
         <w:drawing>
           <wp:inline xmlns:a="http://schemas.openxmlformats.org/drawingml/2006/main" xmlns:pic="http://schemas.openxmlformats.org/drawingml/2006/picture">
             <wp:extent cx="4786426" cy="2180386"/>
-            <wp:docPr id="6" name="Picture 6"/>
+            <wp:docPr id="7" name="Picture 7"/>
             <wp:cNvGraphicFramePr>
               <a:graphicFrameLocks noChangeAspect="1"/>
             </wp:cNvGraphicFramePr>
@@ -5044,7 +4894,7 @@
                     <pic:cNvPicPr/>
                   </pic:nvPicPr>
                   <pic:blipFill>
-                    <a:blip r:embed="rId15"/>
+                    <a:blip r:embed="rId16"/>
                     <a:stretch>
                       <a:fillRect/>
                     </a:stretch>
@@ -5099,7 +4949,7 @@
           <w:color w:val="000000"/>
           <w:sz w:val="24"/>
         </w:rPr>
-        <w:t>Figure 5 shows the confusion matrix of the ensemble. Out of 4,302 benign scripts, 4,272 (99.3%) were correctly classified, and out of 1,875 malicious scripts, 1,803 (96.2%) were correctly detected.</w:t>
+        <w:t>The confusion matrix for the ensemble is illustrated in Figure 5. Among the 4,302 benign scripts, 4,272 (99.3%) were accurately identified, while among the 1,875 malicious scripts, 1,803 (96.2%) were detected correctly.</w:t>
       </w:r>
     </w:p>
     <w:p>
@@ -5112,7 +4962,7 @@
         <w:drawing>
           <wp:inline xmlns:a="http://schemas.openxmlformats.org/drawingml/2006/main" xmlns:pic="http://schemas.openxmlformats.org/drawingml/2006/picture">
             <wp:extent cx="3156204" cy="1531772"/>
-            <wp:docPr id="7" name="Picture 7"/>
+            <wp:docPr id="8" name="Picture 8"/>
             <wp:cNvGraphicFramePr>
               <a:graphicFrameLocks noChangeAspect="1"/>
             </wp:cNvGraphicFramePr>
@@ -5124,7 +4974,7 @@
                     <pic:cNvPicPr/>
                   </pic:nvPicPr>
                   <pic:blipFill>
-                    <a:blip r:embed="rId16"/>
+                    <a:blip r:embed="rId17"/>
                     <a:stretch>
                       <a:fillRect/>
                     </a:stretch>
@@ -5179,7 +5029,7 @@
           <w:color w:val="000000"/>
           <w:sz w:val="24"/>
         </w:rPr>
-        <w:t>Effect of removing duplicates.</w:t>
+        <w:t>Effect of eliminating duplicate records.</w:t>
       </w:r>
       <w:r>
         <w:rPr>
@@ -5199,7 +5049,7 @@
           <w:color w:val="000000"/>
           <w:sz w:val="24"/>
         </w:rPr>
-        <w:t xml:space="preserve"> When the ensemble was tested on the original data with duplicates and a simple random split, its F1-score rose to 0.988 and the share of missed malicious scripts fell from 3.8% to 1.7%. This higher result is misleading, because the model was partly tested on copies of scripts it had already seen. Without cleaning, the number of attacks missed in real use would have been underestimated by more than half, which agrees with the warnings of Arp et al. [36] and Pendlebury et al. [37].</w:t>
+        <w:t xml:space="preserve"> Upon running the ensemble on data containing duplicate records with a simple random partition, the F1-score of the algorithm increased to 0.988, and the percentage of missed malicous scripts decreased to 1.7%. This increase in the value can be deceiving, since the algorithm was partially trained on scripts that it was supposed to encounter again in the future. In this case, without cleansing, the actual number of attacks missed would be overestimated by more than half, in accordance with the remarks by Arp et al. [36] and Pendlebury et al. [37].</w:t>
       </w:r>
     </w:p>
     <w:p>
@@ -5234,7 +5084,7 @@
           <w:color w:val="000000"/>
           <w:sz w:val="24"/>
         </w:rPr>
-        <w:t xml:space="preserve"> The models were also tested on the “mixed” scripts, where malicious code is hidden inside a long normal script, a trick similar to the disguised droppers in the Emotet case. This was the main weakness found: the ensemble detected only 46.7% of these scripts, because the large amount of normal code hides the small malicious part. When examples of mixed scripts were added to the training data, detection rose to 96.4%, while false alarms on normal scripts increased only slightly (from 0.70% to 1.05%). Training with such examples is therefore recommended.</w:t>
+        <w:t xml:space="preserve"> Malicious code that is embedded within an otherwise legitimate script. This problem became obvious in testing the models on the “mixed” scripts, which have a malicious code embedded into a long legitimate script, similar to the Emotet's “dropper” disguise. This became the primary vulnerability of the ensemble, which could identify 46.7% of such cases. The reason was that there was a lot of legitimate code covering up for the relatively small malicious part of it. Adding examples of mixed scripts to the training dataset increased detection rate up to 96.4%, while causing only a slight increase in false positives (0.70% to 1.05%).</w:t>
       </w:r>
     </w:p>
     <w:p>
@@ -6152,7 +6002,7 @@
           <w:color w:val="000000"/>
           <w:sz w:val="24"/>
         </w:rPr>
-        <w:t>The document's macro starts PowerShell with an encoded command. Windows decodes the command before running it and records the readable script as Event ID 4104.</w:t>
+        <w:t>In the document, the macro invokes PowerShell to execute the command that is encoded. When executed, Windows decodes the command and logs the decoded script as event id 4104.</w:t>
       </w:r>
     </w:p>
     <w:p>
@@ -6180,7 +6030,7 @@
           <w:color w:val="000000"/>
           <w:sz w:val="24"/>
         </w:rPr>
-        <w:t>The system receives the event within seconds and extracts its features. The encoding indicator (T1027) and the download indicator (T1105) are both present, and the text features match patterns of known downloaders, so the model gives a high risk score.</w:t>
+        <w:t>It takes the event after seconds and then analyzes its features. Both encoding (T1027) and downloading (T1105) indicators are available, and the textual features are similar to those of the known downloaders, resulting in a high risk score.</w:t>
       </w:r>
     </w:p>
     <w:p>
@@ -6208,7 +6058,7 @@
           <w:color w:val="000000"/>
           <w:sz w:val="24"/>
         </w:rPr>
-        <w:t>Because the score is above 0.70, the script is contained: the PowerShell process is stopped, the file is quarantined and the download address is blocked, so the next stage of the malware is never fetched.</w:t>
+        <w:t>Since the value is greater than 0.70, the script becomes contained as the powershell process is terminated, the file is quarantined and its download location blocked, ensuring that the next stage of the malware never downloads.</w:t>
       </w:r>
     </w:p>
     <w:p>
@@ -6236,7 +6086,7 @@
           <w:color w:val="000000"/>
           <w:sz w:val="24"/>
         </w:rPr>
-        <w:t>The security team receives an alert listing the score, the ATT&amp;CK techniques and the blocked address. If signs of code injection or credential theft were also present with a very high score, isolation of the computer would be proposed and would wait for an analyst's approval.</w:t>
+        <w:t>The security team will receive an alert that will contain the score, the ATT&amp;CK technique used, and the blocked address. Should the presence of code injection and credential theft have been observed with an extremely high score, then computer isolation will be recommended, pending the analyst's approval.</w:t>
       </w:r>
     </w:p>
     <w:p>
@@ -6251,7 +6101,7 @@
           <w:color w:val="000000"/>
           <w:sz w:val="24"/>
         </w:rPr>
-        <w:t>This walkthrough shows how the lessons from the case study (use existing logs, look at behaviour, respond quickly and explain every decision) are reflected in the design of the system.</w:t>
+        <w:t>This walk-through highlights how the lessons learned from the case study (use current logs, consider the behavior, react fast, and explain each decision) can be seen in the system's architecture.</w:t>
       </w:r>
     </w:p>
     <w:p>
@@ -6286,21 +6136,7 @@
           <w:color w:val="000000"/>
           <w:sz w:val="24"/>
         </w:rPr>
-        <w:t xml:space="preserve"> The study has some limitations. Only one public dataset was used, so the results should be checked again on real company data. The system looks only at the script text and not at other information such as which program started the script, which would help in cases like Odinaff where legitimate tools are misused. Most mistakes were made on scripts that can be used for both good and bad purposes, such as system tools that also use low-level Windows functions. Finally, the response actions were tested in a safe simulation, not on a real network.</w:t>
-      </w:r>
-    </w:p>
-    <w:p>
-      <w:pPr>
-        <w:pStyle w:val="Heading1"/>
-      </w:pPr>
-      <w:r>
-        <w:rPr>
-          <w:rFonts w:ascii="Times New Roman" w:hAnsi="Times New Roman" w:cs="Times New Roman" w:eastAsia="Times New Roman"/>
-          <w:b/>
-          <w:color w:val="000000"/>
-          <w:sz w:val="28"/>
-        </w:rPr>
-        <w:t>7  Conclusion</w:t>
+        <w:t xml:space="preserve"> Some limitations exist in the research. It uses just one publicly available database; therefore, further verification is required by performing tests using the actual data of enterprises. The proposed solution analyzes only the text of the script and not additional information about it, such as which application runs this script, which may be useful in cases like Odinaff, when legal software is misused.</w:t>
       </w:r>
     </w:p>
     <w:p>
@@ -6315,7 +6151,7 @@
           <w:color w:val="000000"/>
           <w:sz w:val="24"/>
         </w:rPr>
-        <w:t>This case study examined how PowerShell is used in real attacks and how machine learning can help defend against them. The Odinaff, APT29, Emotet and REvil cases show that attackers use PowerShell at every stage of an attack, disguise their scripts to avoid signatures, and can cause serious damage very quickly. From these lessons, a system was built that scores PowerShell scripts from Windows logs and responds automatically. After removing duplicates and wrong labels from the MPSD dataset, an ensemble of a text-based logistic regression model and a behaviour-based random forest reached an F1-score of 0.972, detecting 96.2% of malicious scripts with only 0.7% false alarms. In a test on unseen scripts, the response system stopped 91.2% of malicious scripts, wrongly blocked only 0.23% of benign scripts and needed about 91 milliseconds per script. Two further lessons emerged: datasets must be checked for duplicates, otherwise results look better than they are, and malicious code hidden inside normal scripts needs special training examples. In future, the system can be tested on real company logs, connected to AMSI to block scripts before they run, given information about running processes, and combined with large language models that explain alerts to analysts [34]. Overall, explainable machine learning together with a careful, human-supervised response policy offers a practical defence against PowerShell attacks, in line with expert advice to keep PowerShell but monitor it closely [5].</w:t>
+        <w:t>This case study explored the application of PowerShell by attackers and the possibilities of using machine learning in order to prevent the corresponding cyber attacks. Four cases – Odinaff, APT29, Emotet and REvil – demonstrated how attackers exploit PowerShell at all stages of attacks, disguise the scripts in order to make them signature-less, and do significant harm within seconds. Based on this analysis, a system which ranks PowerShell scripts based on Windows logs and automatically provides a response was developed. As a result of removing duplicates and mislabeled data from the MPSD dataset, an ensemble of a text-based logistic regression and a behavior-based random forest achieved the F1-score of 0.972 and detected 96.2% of malicious scripts while producing false alarms only in 0.7%. For an out-of-sample test, the response system managed to prevent 91.2% of malicious scripts, made mistakes blocking 0.23% of benign scripts and required 91 milliseconds per one script. Two more lessons were obtained. First, it was found that duplicate detection is required when working with the dataset to avoid the illusion of high-quality results. Second, malicious scripts embedded into the legitimate ones require special training samples. For future research, the following steps are recommended. The system can be applied to company logs, integrated with AMSI in order to prevent execution of suspicious scripts, provided with data about currently running processes and combined with the large language models providing explanations for the alerts [34]. Thus, explainable machine learning combined with proper response policy constitutes the efficient defense against PowerShell attacks which correspond to expert recommendations to control PowerShell [5].</w:t>
       </w:r>
     </w:p>
     <w:p>
@@ -8105,7 +7941,7 @@
       </w:r>
     </w:p>
     <w:sectPr>
-      <w:footerReference w:type="default" r:id="rId9"/>
+      <w:footerReference w:type="default" r:id="rId10"/>
       <w:pgSz w:w="11906" w:h="16838"/>
       <w:pgMar w:top="1440" w:right="1440" w:bottom="1440" w:left="1440" w:header="720" w:footer="720" w:gutter="0"/>
       <w:pgNumType w:start="1"/>

</xml_diff>